<commit_message>
Update cheatsheet DOCX to 28 skills + 2 pipelines
Adds 8 missing skills (tam-sam-som-calculator, finance-metrics-quickref,
executive-briefing, managing-up, written-communication, giving-presentations,
vibe-coding, skill-authoring-workflow), removes pattern-pptx duplicate row,
and updates subtitle from "21 skills · 4 layers" to "28 skills · 2 pipelines".

Co-Authored-By: Claude Sonnet 4.6 <noreply@anthropic.com>
</commit_message>
<xml_diff>
--- a/docs/Claude_Skills_CheatSheet.docx
+++ b/docs/Claude_Skills_CheatSheet.docx
@@ -27,7 +27,7 @@
           <w:color w:val="666666"/>
           <w:sz w:val="16"/>
         </w:rPr>
-        <w:t>21 skills · 4 layers · Pattern Investment Team · April 2026</w:t>
+        <w:t>28 skills · 2 pipelines · Pattern Investment Team · April 2026 · Pattern Investment Team · April 2026</w:t>
       </w:r>
     </w:p>
     <w:tbl>
@@ -777,6 +777,109 @@
           </w:p>
         </w:tc>
       </w:tr>
+      <w:tr w14:paraId="D2E3F4A5A0">
+        <w:tc>
+          <w:tcPr>
+            <w:tcW w:w="650" w:type="dxa"/>
+            <w:shd w:val="clear" w:color="auto" w:fill="E6EFFD"/>
+            <w:tcMar>
+              <w:top w:w="30" w:type="dxa"/>
+              <w:left w:w="80" w:type="dxa"/>
+              <w:bottom w:w="30" w:type="dxa"/>
+              <w:right w:w="80" w:type="dxa"/>
+            </w:tcMar>
+          </w:tcPr>
+          <w:p w14:paraId="D2E3F4A5A1">
+            <w:pPr>
+              <w:spacing w:after="0" w:line="240" w:lineRule="auto"/>
+              <w:jc w:val="center"/>
+            </w:pPr>
+            <w:r>
+              <w:rPr>
+                <w:rFonts w:ascii="Wix Madefor Display SemiBold" w:hAnsi="Wix Madefor Display SemiBold"/>
+                <w:b/>
+                <w:color w:val="4280F4"/>
+                <w:sz w:val="16"/>
+              </w:rPr>
+              <w:t>L5</w:t>
+            </w:r>
+          </w:p>
+        </w:tc>
+        <w:tc>
+          <w:tcPr>
+            <w:tcW w:w="1700" w:type="dxa"/>
+            <w:tcMar>
+              <w:top w:w="30" w:type="dxa"/>
+              <w:left w:w="80" w:type="dxa"/>
+              <w:bottom w:w="30" w:type="dxa"/>
+              <w:right w:w="80" w:type="dxa"/>
+            </w:tcMar>
+          </w:tcPr>
+          <w:p w14:paraId="D2E3F4A5A2">
+            <w:pPr>
+              <w:spacing w:after="0" w:line="240" w:lineRule="auto"/>
+            </w:pPr>
+            <w:r>
+              <w:rPr>
+                <w:rFonts w:ascii="Wix Madefor Display SemiBold" w:hAnsi="Wix Madefor Display SemiBold"/>
+                <w:b/>
+                <w:color w:val="0F4761"/>
+                <w:sz w:val="17"/>
+              </w:rPr>
+              <w:t>managing-up</w:t>
+            </w:r>
+          </w:p>
+        </w:tc>
+        <w:tc>
+          <w:tcPr>
+            <w:tcW w:w="6500" w:type="dxa"/>
+            <w:tcMar>
+              <w:top w:w="30" w:type="dxa"/>
+              <w:left w:w="80" w:type="dxa"/>
+              <w:bottom w:w="30" w:type="dxa"/>
+              <w:right w:w="80" w:type="dxa"/>
+            </w:tcMar>
+          </w:tcPr>
+          <w:p w14:paraId="D2E3F4A5A3">
+            <w:pPr>
+              <w:spacing w:after="0" w:line="252" w:lineRule="auto"/>
+            </w:pPr>
+            <w:r>
+              <w:rPr>
+                <w:rFonts w:ascii="Wix Madefor Display" w:hAnsi="Wix Madefor Display"/>
+                <w:color w:val="000000"/>
+                <w:sz w:val="16"/>
+              </w:rPr>
+              <w:t>Frameworks for executive relationship management, influencing leadership without authority, and navigating organizational dynamics. Covers upward communication, alignment, and managing difficult conversations.</w:t>
+            </w:r>
+          </w:p>
+        </w:tc>
+        <w:tc>
+          <w:tcPr>
+            <w:tcW w:w="5850" w:type="dxa"/>
+            <w:tcMar>
+              <w:top w:w="30" w:type="dxa"/>
+              <w:left w:w="80" w:type="dxa"/>
+              <w:bottom w:w="30" w:type="dxa"/>
+              <w:right w:w="80" w:type="dxa"/>
+            </w:tcMar>
+          </w:tcPr>
+          <w:p w14:paraId="D2E3F4A5A4">
+            <w:pPr>
+              <w:spacing w:after="0" w:line="252" w:lineRule="auto"/>
+            </w:pPr>
+            <w:r>
+              <w:rPr>
+                <w:rFonts w:ascii="Wix Madefor Display" w:hAnsi="Wix Madefor Display"/>
+                <w:i/>
+                <w:color w:val="000000"/>
+                <w:sz w:val="16"/>
+              </w:rPr>
+              <w:t>Structured advice, communication scripts, or frameworks — no formal document output</w:t>
+            </w:r>
+          </w:p>
+        </w:tc>
+      </w:tr>
       <w:tr>
         <w:tc>
           <w:tcPr>
@@ -1507,11 +1610,11 @@
           </w:p>
         </w:tc>
       </w:tr>
-      <w:tr>
+      <w:tr w14:paraId="E3F4A5B6A0">
         <w:tc>
           <w:tcPr>
             <w:tcW w:w="650" w:type="dxa"/>
-            <w:shd w:val="clear" w:color="auto" w:fill="EAF3DE"/>
+            <w:shd w:val="clear" w:color="auto" w:fill="E6EFFD"/>
             <w:tcMar>
               <w:top w:w="30" w:type="dxa"/>
               <w:left w:w="80" w:type="dxa"/>
@@ -1519,7 +1622,7 @@
               <w:right w:w="80" w:type="dxa"/>
             </w:tcMar>
           </w:tcPr>
-          <w:p>
+          <w:p w14:paraId="E3F4A5B6A1">
             <w:pPr>
               <w:spacing w:after="0" w:line="240" w:lineRule="auto"/>
               <w:jc w:val="center"/>
@@ -1528,7 +1631,7 @@
               <w:rPr>
                 <w:rFonts w:ascii="Wix Madefor Display SemiBold" w:hAnsi="Wix Madefor Display SemiBold"/>
                 <w:b/>
-                <w:color w:val="375623"/>
+                <w:color w:val="4280F4"/>
                 <w:sz w:val="16"/>
               </w:rPr>
               <w:t>L4</w:t>
@@ -1538,7 +1641,6 @@
         <w:tc>
           <w:tcPr>
             <w:tcW w:w="1700" w:type="dxa"/>
-            <w:shd w:val="clear" w:color="auto" w:fill="F8F8F8"/>
             <w:tcMar>
               <w:top w:w="30" w:type="dxa"/>
               <w:left w:w="80" w:type="dxa"/>
@@ -1546,7 +1648,7 @@
               <w:right w:w="80" w:type="dxa"/>
             </w:tcMar>
           </w:tcPr>
-          <w:p>
+          <w:p w14:paraId="E3F4A5B6A2">
             <w:pPr>
               <w:spacing w:after="0" w:line="240" w:lineRule="auto"/>
             </w:pPr>
@@ -1557,14 +1659,13 @@
                 <w:color w:val="0F4761"/>
                 <w:sz w:val="17"/>
               </w:rPr>
-              <w:t>pattern-pptx</w:t>
+              <w:t>written-communication</w:t>
             </w:r>
           </w:p>
         </w:tc>
         <w:tc>
           <w:tcPr>
             <w:tcW w:w="6500" w:type="dxa"/>
-            <w:shd w:val="clear" w:color="auto" w:fill="F8F8F8"/>
             <w:tcMar>
               <w:top w:w="30" w:type="dxa"/>
               <w:left w:w="80" w:type="dxa"/>
@@ -1572,7 +1673,7 @@
               <w:right w:w="80" w:type="dxa"/>
             </w:tcMar>
           </w:tcPr>
-          <w:p>
+          <w:p w14:paraId="E3F4A5B6A3">
             <w:pPr>
               <w:spacing w:after="0" w:line="252" w:lineRule="auto"/>
             </w:pPr>
@@ -1582,14 +1683,13 @@
                 <w:color w:val="000000"/>
                 <w:sz w:val="16"/>
               </w:rPr>
-              <w:t>Non-investment Pattern presentations.</w:t>
+              <w:t>Emails, memos, strategy documents, and announcements. Covers tone calibration for audience and stakes, structure selection (BLUF vs. narrative), and edit passes. For external communications and internal alignment.</w:t>
             </w:r>
           </w:p>
         </w:tc>
         <w:tc>
           <w:tcPr>
             <w:tcW w:w="5850" w:type="dxa"/>
-            <w:shd w:val="clear" w:color="auto" w:fill="F8F8F8"/>
             <w:tcMar>
               <w:top w:w="30" w:type="dxa"/>
               <w:left w:w="80" w:type="dxa"/>
@@ -1597,7 +1697,7 @@
               <w:right w:w="80" w:type="dxa"/>
             </w:tcMar>
           </w:tcPr>
-          <w:p>
+          <w:p w14:paraId="E3F4A5B6A4">
             <w:pPr>
               <w:spacing w:after="0" w:line="252" w:lineRule="auto"/>
             </w:pPr>
@@ -1608,7 +1708,110 @@
                 <w:color w:val="000000"/>
                 <w:sz w:val="16"/>
               </w:rPr>
-              <w:t>Pattern PowerPoint for non-investment materials</w:t>
+              <w:t>Polished email, memo, or announcement in Pattern voice</w:t>
+            </w:r>
+          </w:p>
+        </w:tc>
+      </w:tr>
+      <w:tr w14:paraId="F4A5B6C7A0">
+        <w:tc>
+          <w:tcPr>
+            <w:tcW w:w="650" w:type="dxa"/>
+            <w:shd w:val="clear" w:color="auto" w:fill="E6EFFD"/>
+            <w:tcMar>
+              <w:top w:w="30" w:type="dxa"/>
+              <w:left w:w="80" w:type="dxa"/>
+              <w:bottom w:w="30" w:type="dxa"/>
+              <w:right w:w="80" w:type="dxa"/>
+            </w:tcMar>
+          </w:tcPr>
+          <w:p w14:paraId="F4A5B6C7A1">
+            <w:pPr>
+              <w:spacing w:after="0" w:line="240" w:lineRule="auto"/>
+              <w:jc w:val="center"/>
+            </w:pPr>
+            <w:r>
+              <w:rPr>
+                <w:rFonts w:ascii="Wix Madefor Display SemiBold" w:hAnsi="Wix Madefor Display SemiBold"/>
+                <w:b/>
+                <w:color w:val="4280F4"/>
+                <w:sz w:val="16"/>
+              </w:rPr>
+              <w:t>L4</w:t>
+            </w:r>
+          </w:p>
+        </w:tc>
+        <w:tc>
+          <w:tcPr>
+            <w:tcW w:w="1700" w:type="dxa"/>
+            <w:tcMar>
+              <w:top w:w="30" w:type="dxa"/>
+              <w:left w:w="80" w:type="dxa"/>
+              <w:bottom w:w="30" w:type="dxa"/>
+              <w:right w:w="80" w:type="dxa"/>
+            </w:tcMar>
+          </w:tcPr>
+          <w:p w14:paraId="F4A5B6C7A2">
+            <w:pPr>
+              <w:spacing w:after="0" w:line="240" w:lineRule="auto"/>
+            </w:pPr>
+            <w:r>
+              <w:rPr>
+                <w:rFonts w:ascii="Wix Madefor Display SemiBold" w:hAnsi="Wix Madefor Display SemiBold"/>
+                <w:b/>
+                <w:color w:val="0F4761"/>
+                <w:sz w:val="17"/>
+              </w:rPr>
+              <w:t>giving-presentations</w:t>
+            </w:r>
+          </w:p>
+        </w:tc>
+        <w:tc>
+          <w:tcPr>
+            <w:tcW w:w="6500" w:type="dxa"/>
+            <w:tcMar>
+              <w:top w:w="30" w:type="dxa"/>
+              <w:left w:w="80" w:type="dxa"/>
+              <w:bottom w:w="30" w:type="dxa"/>
+              <w:right w:w="80" w:type="dxa"/>
+            </w:tcMar>
+          </w:tcPr>
+          <w:p w14:paraId="F4A5B6C7A3">
+            <w:pPr>
+              <w:spacing w:after="0" w:line="252" w:lineRule="auto"/>
+            </w:pPr>
+            <w:r>
+              <w:rPr>
+                <w:rFonts w:ascii="Wix Madefor Display" w:hAnsi="Wix Madefor Display"/>
+                <w:color w:val="000000"/>
+                <w:sz w:val="16"/>
+              </w:rPr>
+              <w:t>Talk track preparation, slide deck narrative design, and presentation delivery coaching. Maps content to audience decision needs. Structures opening hook, logical flow, and close.</w:t>
+            </w:r>
+          </w:p>
+        </w:tc>
+        <w:tc>
+          <w:tcPr>
+            <w:tcW w:w="5850" w:type="dxa"/>
+            <w:tcMar>
+              <w:top w:w="30" w:type="dxa"/>
+              <w:left w:w="80" w:type="dxa"/>
+              <w:bottom w:w="30" w:type="dxa"/>
+              <w:right w:w="80" w:type="dxa"/>
+            </w:tcMar>
+          </w:tcPr>
+          <w:p w14:paraId="F4A5B6C7A4">
+            <w:pPr>
+              <w:spacing w:after="0" w:line="252" w:lineRule="auto"/>
+            </w:pPr>
+            <w:r>
+              <w:rPr>
+                <w:rFonts w:ascii="Wix Madefor Display" w:hAnsi="Wix Madefor Display"/>
+                <w:i/>
+                <w:color w:val="000000"/>
+                <w:sz w:val="16"/>
+              </w:rPr>
+              <w:t>Talk track outline, narrative arc, or slide-by-slide notes</w:t>
             </w:r>
           </w:p>
         </w:tc>
@@ -1712,6 +1915,109 @@
                 <w:sz w:val="16"/>
               </w:rPr>
               <w:t>Branded .docx due diligence request list</w:t>
+            </w:r>
+          </w:p>
+        </w:tc>
+      </w:tr>
+      <w:tr w14:paraId="A5B6C7D8A0">
+        <w:tc>
+          <w:tcPr>
+            <w:tcW w:w="650" w:type="dxa"/>
+            <w:shd w:val="clear" w:color="auto" w:fill="E6EFFD"/>
+            <w:tcMar>
+              <w:top w:w="30" w:type="dxa"/>
+              <w:left w:w="80" w:type="dxa"/>
+              <w:bottom w:w="30" w:type="dxa"/>
+              <w:right w:w="80" w:type="dxa"/>
+            </w:tcMar>
+          </w:tcPr>
+          <w:p w14:paraId="A5B6C7D8A1">
+            <w:pPr>
+              <w:spacing w:after="0" w:line="240" w:lineRule="auto"/>
+              <w:jc w:val="center"/>
+            </w:pPr>
+            <w:r>
+              <w:rPr>
+                <w:rFonts w:ascii="Wix Madefor Display SemiBold" w:hAnsi="Wix Madefor Display SemiBold"/>
+                <w:b/>
+                <w:color w:val="4280F4"/>
+                <w:sz w:val="16"/>
+              </w:rPr>
+              <w:t>L4</w:t>
+            </w:r>
+          </w:p>
+        </w:tc>
+        <w:tc>
+          <w:tcPr>
+            <w:tcW w:w="1700" w:type="dxa"/>
+            <w:tcMar>
+              <w:top w:w="30" w:type="dxa"/>
+              <w:left w:w="80" w:type="dxa"/>
+              <w:bottom w:w="30" w:type="dxa"/>
+              <w:right w:w="80" w:type="dxa"/>
+            </w:tcMar>
+          </w:tcPr>
+          <w:p w14:paraId="A5B6C7D8A2">
+            <w:pPr>
+              <w:spacing w:after="0" w:line="240" w:lineRule="auto"/>
+            </w:pPr>
+            <w:r>
+              <w:rPr>
+                <w:rFonts w:ascii="Wix Madefor Display SemiBold" w:hAnsi="Wix Madefor Display SemiBold"/>
+                <w:b/>
+                <w:color w:val="0F4761"/>
+                <w:sz w:val="17"/>
+              </w:rPr>
+              <w:t>executive-briefing</w:t>
+            </w:r>
+          </w:p>
+        </w:tc>
+        <w:tc>
+          <w:tcPr>
+            <w:tcW w:w="6500" w:type="dxa"/>
+            <w:tcMar>
+              <w:top w:w="30" w:type="dxa"/>
+              <w:left w:w="80" w:type="dxa"/>
+              <w:bottom w:w="30" w:type="dxa"/>
+              <w:right w:w="80" w:type="dxa"/>
+            </w:tcMar>
+          </w:tcPr>
+          <w:p w14:paraId="A5B6C7D8A3">
+            <w:pPr>
+              <w:spacing w:after="0" w:line="252" w:lineRule="auto"/>
+            </w:pPr>
+            <w:r>
+              <w:rPr>
+                <w:rFonts w:ascii="Wix Madefor Display" w:hAnsi="Wix Madefor Display"/>
+                <w:color w:val="000000"/>
+                <w:sz w:val="16"/>
+              </w:rPr>
+              <w:t>Executive-ready briefing documents: memos, one-pagers, board notes, C-suite briefings. Enforces BLUF structure and decision-oriented formatting. Output is action-forcing, not informational.</w:t>
+            </w:r>
+          </w:p>
+        </w:tc>
+        <w:tc>
+          <w:tcPr>
+            <w:tcW w:w="5850" w:type="dxa"/>
+            <w:tcMar>
+              <w:top w:w="30" w:type="dxa"/>
+              <w:left w:w="80" w:type="dxa"/>
+              <w:bottom w:w="30" w:type="dxa"/>
+              <w:right w:w="80" w:type="dxa"/>
+            </w:tcMar>
+          </w:tcPr>
+          <w:p w14:paraId="A5B6C7D8A4">
+            <w:pPr>
+              <w:spacing w:after="0" w:line="252" w:lineRule="auto"/>
+            </w:pPr>
+            <w:r>
+              <w:rPr>
+                <w:rFonts w:ascii="Wix Madefor Display" w:hAnsi="Wix Madefor Display"/>
+                <w:i/>
+                <w:color w:val="000000"/>
+                <w:sz w:val="16"/>
+              </w:rPr>
+              <w:t>Pattern-branded one-pager, board note, or executive memo (.docx)</w:t>
             </w:r>
           </w:p>
         </w:tc>
@@ -2131,6 +2437,109 @@
           </w:p>
         </w:tc>
       </w:tr>
+      <w:tr w14:paraId="C1D2E3F4A0">
+        <w:tc>
+          <w:tcPr>
+            <w:tcW w:w="650" w:type="dxa"/>
+            <w:shd w:val="clear" w:color="auto" w:fill="E6EFFD"/>
+            <w:tcMar>
+              <w:top w:w="30" w:type="dxa"/>
+              <w:left w:w="80" w:type="dxa"/>
+              <w:bottom w:w="30" w:type="dxa"/>
+              <w:right w:w="80" w:type="dxa"/>
+            </w:tcMar>
+          </w:tcPr>
+          <w:p w14:paraId="C1D2E3F4A1">
+            <w:pPr>
+              <w:spacing w:after="0" w:line="240" w:lineRule="auto"/>
+              <w:jc w:val="center"/>
+            </w:pPr>
+            <w:r>
+              <w:rPr>
+                <w:rFonts w:ascii="Wix Madefor Display SemiBold" w:hAnsi="Wix Madefor Display SemiBold"/>
+                <w:b/>
+                <w:color w:val="4280F4"/>
+                <w:sz w:val="16"/>
+              </w:rPr>
+              <w:t>L2</w:t>
+            </w:r>
+          </w:p>
+        </w:tc>
+        <w:tc>
+          <w:tcPr>
+            <w:tcW w:w="1700" w:type="dxa"/>
+            <w:tcMar>
+              <w:top w:w="30" w:type="dxa"/>
+              <w:left w:w="80" w:type="dxa"/>
+              <w:bottom w:w="30" w:type="dxa"/>
+              <w:right w:w="80" w:type="dxa"/>
+            </w:tcMar>
+          </w:tcPr>
+          <w:p w14:paraId="C1D2E3F4A2">
+            <w:pPr>
+              <w:spacing w:after="0" w:line="240" w:lineRule="auto"/>
+            </w:pPr>
+            <w:r>
+              <w:rPr>
+                <w:rFonts w:ascii="Wix Madefor Display SemiBold" w:hAnsi="Wix Madefor Display SemiBold"/>
+                <w:b/>
+                <w:color w:val="0F4761"/>
+                <w:sz w:val="17"/>
+              </w:rPr>
+              <w:t>tam-sam-som-calculator</w:t>
+            </w:r>
+          </w:p>
+        </w:tc>
+        <w:tc>
+          <w:tcPr>
+            <w:tcW w:w="6500" w:type="dxa"/>
+            <w:tcMar>
+              <w:top w:w="30" w:type="dxa"/>
+              <w:left w:w="80" w:type="dxa"/>
+              <w:bottom w:w="30" w:type="dxa"/>
+              <w:right w:w="80" w:type="dxa"/>
+            </w:tcMar>
+          </w:tcPr>
+          <w:p w14:paraId="C1D2E3F4A3">
+            <w:pPr>
+              <w:spacing w:after="0" w:line="252" w:lineRule="auto"/>
+            </w:pPr>
+            <w:r>
+              <w:rPr>
+                <w:rFonts w:ascii="Wix Madefor Display" w:hAnsi="Wix Madefor Display"/>
+                <w:color w:val="000000"/>
+                <w:sz w:val="16"/>
+              </w:rPr>
+              <w:t>Market sizing with both top-down and bottom-up approaches. Labels every assumption as fact/estimate/hypothesis. Requires both methods; reconciles divergences &gt;25%. Includes sensitivity analysis on key drivers.</w:t>
+            </w:r>
+          </w:p>
+        </w:tc>
+        <w:tc>
+          <w:tcPr>
+            <w:tcW w:w="5850" w:type="dxa"/>
+            <w:tcMar>
+              <w:top w:w="30" w:type="dxa"/>
+              <w:left w:w="80" w:type="dxa"/>
+              <w:bottom w:w="30" w:type="dxa"/>
+              <w:right w:w="80" w:type="dxa"/>
+            </w:tcMar>
+          </w:tcPr>
+          <w:p w14:paraId="C1D2E3F4A4">
+            <w:pPr>
+              <w:spacing w:after="0" w:line="252" w:lineRule="auto"/>
+            </w:pPr>
+            <w:r>
+              <w:rPr>
+                <w:rFonts w:ascii="Wix Madefor Display" w:hAnsi="Wix Madefor Display"/>
+                <w:i/>
+                <w:color w:val="000000"/>
+                <w:sz w:val="16"/>
+              </w:rPr>
+              <w:t>TAM/SAM/SOM table + bottoms-up build + sensitivity matrix (inline or as structured output)</w:t>
+            </w:r>
+          </w:p>
+        </w:tc>
+      </w:tr>
       <w:tr>
         <w:tc>
           <w:tcPr>
@@ -2234,6 +2643,109 @@
           </w:p>
         </w:tc>
       </w:tr>
+      <w:tr w14:paraId="C7D8E9F0A0">
+        <w:tc>
+          <w:tcPr>
+            <w:tcW w:w="650" w:type="dxa"/>
+            <w:shd w:val="clear" w:color="auto" w:fill="E6EFFD"/>
+            <w:tcMar>
+              <w:top w:w="30" w:type="dxa"/>
+              <w:left w:w="80" w:type="dxa"/>
+              <w:bottom w:w="30" w:type="dxa"/>
+              <w:right w:w="80" w:type="dxa"/>
+            </w:tcMar>
+          </w:tcPr>
+          <w:p w14:paraId="C7D8E9F0A1">
+            <w:pPr>
+              <w:spacing w:after="0" w:line="240" w:lineRule="auto"/>
+              <w:jc w:val="center"/>
+            </w:pPr>
+            <w:r>
+              <w:rPr>
+                <w:rFonts w:ascii="Wix Madefor Display SemiBold" w:hAnsi="Wix Madefor Display SemiBold"/>
+                <w:b/>
+                <w:color w:val="4280F4"/>
+                <w:sz w:val="16"/>
+              </w:rPr>
+              <w:t>L7</w:t>
+            </w:r>
+          </w:p>
+        </w:tc>
+        <w:tc>
+          <w:tcPr>
+            <w:tcW w:w="1700" w:type="dxa"/>
+            <w:tcMar>
+              <w:top w:w="30" w:type="dxa"/>
+              <w:left w:w="80" w:type="dxa"/>
+              <w:bottom w:w="30" w:type="dxa"/>
+              <w:right w:w="80" w:type="dxa"/>
+            </w:tcMar>
+          </w:tcPr>
+          <w:p w14:paraId="C7D8E9F0A2">
+            <w:pPr>
+              <w:spacing w:after="0" w:line="240" w:lineRule="auto"/>
+            </w:pPr>
+            <w:r>
+              <w:rPr>
+                <w:rFonts w:ascii="Wix Madefor Display SemiBold" w:hAnsi="Wix Madefor Display SemiBold"/>
+                <w:b/>
+                <w:color w:val="0F4761"/>
+                <w:sz w:val="17"/>
+              </w:rPr>
+              <w:t>vibe-coding</w:t>
+            </w:r>
+          </w:p>
+        </w:tc>
+        <w:tc>
+          <w:tcPr>
+            <w:tcW w:w="6500" w:type="dxa"/>
+            <w:tcMar>
+              <w:top w:w="30" w:type="dxa"/>
+              <w:left w:w="80" w:type="dxa"/>
+              <w:bottom w:w="30" w:type="dxa"/>
+              <w:right w:w="80" w:type="dxa"/>
+            </w:tcMar>
+          </w:tcPr>
+          <w:p w14:paraId="C7D8E9F0A3">
+            <w:pPr>
+              <w:spacing w:after="0" w:line="252" w:lineRule="auto"/>
+            </w:pPr>
+            <w:r>
+              <w:rPr>
+                <w:rFonts w:ascii="Wix Madefor Display" w:hAnsi="Wix Madefor Display"/>
+                <w:color w:val="000000"/>
+                <w:sz w:val="16"/>
+              </w:rPr>
+              <w:t>AI-assisted rapid prototyping — building functional tools, scripts, and apps without deep technical skills. Optimized for speed-to-working-artifact. Produces code that runs, not code that is production-ready.</w:t>
+            </w:r>
+          </w:p>
+        </w:tc>
+        <w:tc>
+          <w:tcPr>
+            <w:tcW w:w="5850" w:type="dxa"/>
+            <w:tcMar>
+              <w:top w:w="30" w:type="dxa"/>
+              <w:left w:w="80" w:type="dxa"/>
+              <w:bottom w:w="30" w:type="dxa"/>
+              <w:right w:w="80" w:type="dxa"/>
+            </w:tcMar>
+          </w:tcPr>
+          <w:p w14:paraId="C7D8E9F0A4">
+            <w:pPr>
+              <w:spacing w:after="0" w:line="252" w:lineRule="auto"/>
+            </w:pPr>
+            <w:r>
+              <w:rPr>
+                <w:rFonts w:ascii="Wix Madefor Display" w:hAnsi="Wix Madefor Display"/>
+                <w:i/>
+                <w:color w:val="000000"/>
+                <w:sz w:val="16"/>
+              </w:rPr>
+              <w:t>Working script, app, or tool (Python, JS, HTML — whatever fits the task)</w:t>
+            </w:r>
+          </w:p>
+        </w:tc>
+      </w:tr>
       <w:tr>
         <w:tc>
           <w:tcPr>
@@ -2333,6 +2845,212 @@
                 <w:sz w:val="16"/>
               </w:rPr>
               <w:t>.xlsx workbook: Input_Fields + Metric_Calcs + Diagnostic_Output + README tabs</w:t>
+            </w:r>
+          </w:p>
+        </w:tc>
+      </w:tr>
+      <w:tr w14:paraId="B6C7D8E9A0">
+        <w:tc>
+          <w:tcPr>
+            <w:tcW w:w="650" w:type="dxa"/>
+            <w:shd w:val="clear" w:color="auto" w:fill="E6EFFD"/>
+            <w:tcMar>
+              <w:top w:w="30" w:type="dxa"/>
+              <w:left w:w="80" w:type="dxa"/>
+              <w:bottom w:w="30" w:type="dxa"/>
+              <w:right w:w="80" w:type="dxa"/>
+            </w:tcMar>
+          </w:tcPr>
+          <w:p w14:paraId="B6C7D8E9A1">
+            <w:pPr>
+              <w:spacing w:after="0" w:line="240" w:lineRule="auto"/>
+              <w:jc w:val="center"/>
+            </w:pPr>
+            <w:r>
+              <w:rPr>
+                <w:rFonts w:ascii="Wix Madefor Display SemiBold" w:hAnsi="Wix Madefor Display SemiBold"/>
+                <w:b/>
+                <w:color w:val="4280F4"/>
+                <w:sz w:val="16"/>
+              </w:rPr>
+              <w:t>L2</w:t>
+            </w:r>
+          </w:p>
+        </w:tc>
+        <w:tc>
+          <w:tcPr>
+            <w:tcW w:w="1700" w:type="dxa"/>
+            <w:tcMar>
+              <w:top w:w="30" w:type="dxa"/>
+              <w:left w:w="80" w:type="dxa"/>
+              <w:bottom w:w="30" w:type="dxa"/>
+              <w:right w:w="80" w:type="dxa"/>
+            </w:tcMar>
+          </w:tcPr>
+          <w:p w14:paraId="B6C7D8E9A2">
+            <w:pPr>
+              <w:spacing w:after="0" w:line="240" w:lineRule="auto"/>
+            </w:pPr>
+            <w:r>
+              <w:rPr>
+                <w:rFonts w:ascii="Wix Madefor Display SemiBold" w:hAnsi="Wix Madefor Display SemiBold"/>
+                <w:b/>
+                <w:color w:val="0F4761"/>
+                <w:sz w:val="17"/>
+              </w:rPr>
+              <w:t>finance-metrics-quickref</w:t>
+            </w:r>
+          </w:p>
+        </w:tc>
+        <w:tc>
+          <w:tcPr>
+            <w:tcW w:w="6500" w:type="dxa"/>
+            <w:tcMar>
+              <w:top w:w="30" w:type="dxa"/>
+              <w:left w:w="80" w:type="dxa"/>
+              <w:bottom w:w="30" w:type="dxa"/>
+              <w:right w:w="80" w:type="dxa"/>
+            </w:tcMar>
+          </w:tcPr>
+          <w:p w14:paraId="B6C7D8E9A3">
+            <w:pPr>
+              <w:spacing w:after="0" w:line="252" w:lineRule="auto"/>
+            </w:pPr>
+            <w:r>
+              <w:rPr>
+                <w:rFonts w:ascii="Wix Madefor Display" w:hAnsi="Wix Madefor Display"/>
+                <w:color w:val="000000"/>
+                <w:sz w:val="16"/>
+              </w:rPr>
+              <w:t>Quick-reference lookup for financial metric definitions, formulas, and benchmarks. Covers SaaS, PE, and general corporate finance. Returns definition, formula, and benchmark range with source.</w:t>
+            </w:r>
+          </w:p>
+        </w:tc>
+        <w:tc>
+          <w:tcPr>
+            <w:tcW w:w="5850" w:type="dxa"/>
+            <w:tcMar>
+              <w:top w:w="30" w:type="dxa"/>
+              <w:left w:w="80" w:type="dxa"/>
+              <w:bottom w:w="30" w:type="dxa"/>
+              <w:right w:w="80" w:type="dxa"/>
+            </w:tcMar>
+          </w:tcPr>
+          <w:p w14:paraId="B6C7D8E9A4">
+            <w:pPr>
+              <w:spacing w:after="0" w:line="252" w:lineRule="auto"/>
+            </w:pPr>
+            <w:r>
+              <w:rPr>
+                <w:rFonts w:ascii="Wix Madefor Display" w:hAnsi="Wix Madefor Display"/>
+                <w:i/>
+                <w:color w:val="000000"/>
+                <w:sz w:val="16"/>
+              </w:rPr>
+              <w:t>Inline definition + formula + benchmark (no separate document)</w:t>
+            </w:r>
+          </w:p>
+        </w:tc>
+      </w:tr>
+      <w:tr w14:paraId="D8E9F0A1A0">
+        <w:tc>
+          <w:tcPr>
+            <w:tcW w:w="650" w:type="dxa"/>
+            <w:shd w:val="clear" w:color="auto" w:fill="E6EFFD"/>
+            <w:tcMar>
+              <w:top w:w="30" w:type="dxa"/>
+              <w:left w:w="80" w:type="dxa"/>
+              <w:bottom w:w="30" w:type="dxa"/>
+              <w:right w:w="80" w:type="dxa"/>
+            </w:tcMar>
+          </w:tcPr>
+          <w:p w14:paraId="D8E9F0A1A1">
+            <w:pPr>
+              <w:spacing w:after="0" w:line="240" w:lineRule="auto"/>
+              <w:jc w:val="center"/>
+            </w:pPr>
+            <w:r>
+              <w:rPr>
+                <w:rFonts w:ascii="Wix Madefor Display SemiBold" w:hAnsi="Wix Madefor Display SemiBold"/>
+                <w:b/>
+                <w:color w:val="4280F4"/>
+                <w:sz w:val="16"/>
+              </w:rPr>
+              <w:t>L8</w:t>
+            </w:r>
+          </w:p>
+        </w:tc>
+        <w:tc>
+          <w:tcPr>
+            <w:tcW w:w="1700" w:type="dxa"/>
+            <w:tcMar>
+              <w:top w:w="30" w:type="dxa"/>
+              <w:left w:w="80" w:type="dxa"/>
+              <w:bottom w:w="30" w:type="dxa"/>
+              <w:right w:w="80" w:type="dxa"/>
+            </w:tcMar>
+          </w:tcPr>
+          <w:p w14:paraId="D8E9F0A1A2">
+            <w:pPr>
+              <w:spacing w:after="0" w:line="240" w:lineRule="auto"/>
+            </w:pPr>
+            <w:r>
+              <w:rPr>
+                <w:rFonts w:ascii="Wix Madefor Display SemiBold" w:hAnsi="Wix Madefor Display SemiBold"/>
+                <w:b/>
+                <w:color w:val="0F4761"/>
+                <w:sz w:val="17"/>
+              </w:rPr>
+              <w:t>skill-authoring-workflow</w:t>
+            </w:r>
+          </w:p>
+        </w:tc>
+        <w:tc>
+          <w:tcPr>
+            <w:tcW w:w="6500" w:type="dxa"/>
+            <w:tcMar>
+              <w:top w:w="30" w:type="dxa"/>
+              <w:left w:w="80" w:type="dxa"/>
+              <w:bottom w:w="30" w:type="dxa"/>
+              <w:right w:w="80" w:type="dxa"/>
+            </w:tcMar>
+          </w:tcPr>
+          <w:p w14:paraId="D8E9F0A1A3">
+            <w:pPr>
+              <w:spacing w:after="0" w:line="252" w:lineRule="auto"/>
+            </w:pPr>
+            <w:r>
+              <w:rPr>
+                <w:rFonts w:ascii="Wix Madefor Display" w:hAnsi="Wix Madefor Display"/>
+                <w:color w:val="000000"/>
+                <w:sz w:val="16"/>
+              </w:rPr>
+              <w:t>Standards and process for creating or updating a skill without breaking conventions. Covers SKILL.md structure, trigger language, integration rules, quality checks, and README/agents.md updates.</w:t>
+            </w:r>
+          </w:p>
+        </w:tc>
+        <w:tc>
+          <w:tcPr>
+            <w:tcW w:w="5850" w:type="dxa"/>
+            <w:tcMar>
+              <w:top w:w="30" w:type="dxa"/>
+              <w:left w:w="80" w:type="dxa"/>
+              <w:bottom w:w="30" w:type="dxa"/>
+              <w:right w:w="80" w:type="dxa"/>
+            </w:tcMar>
+          </w:tcPr>
+          <w:p w14:paraId="D8E9F0A1A4">
+            <w:pPr>
+              <w:spacing w:after="0" w:line="252" w:lineRule="auto"/>
+            </w:pPr>
+            <w:r>
+              <w:rPr>
+                <w:rFonts w:ascii="Wix Madefor Display" w:hAnsi="Wix Madefor Display"/>
+                <w:i/>
+                <w:color w:val="000000"/>
+                <w:sz w:val="16"/>
+              </w:rPr>
+              <w:t>SKILL.md file + README/agents.md entries ready to commit</w:t>
             </w:r>
           </w:p>
         </w:tc>

</xml_diff>